<commit_message>
Redesign portfolio with dark editorial layout
Dark green-black theme with the Erode serif, the name and portrait as
the hero, results written as a sentence beside an interactive
PostgreSQL 13 vs 17 query comparison, an index of work with a sticky
detail panel, and a full-width contact email. Drops the theme toggle,
adds robots.txt, sitemap.xml and a build script for dist.

Co-Authored-By: Claude Opus 5.5 <noreply@anthropic.com>
</commit_message>
<xml_diff>
--- a/CV_Pedro_Zahonero_ES.docx
+++ b/CV_Pedro_Zahonero_ES.docx
@@ -153,7 +153,7 @@
           <w:color w:val="000000"/>
           <w:sz w:val="17"/>
         </w:rPr>
-        <w:t>Migré la configuración de toda la aplicación de Webpack a Vite mediante una rama aislada, completando el 95% del cambio sin interrumpir los despliegues semanales.</w:t>
+        <w:t>Completé la migración técnica de toda la aplicación de Webpack a Vite en una rama independiente, manteniendo las entregas habituales mientras se finalizan los ajustes de UI previos al despliegue en producción.</w:t>
       </w:r>
     </w:p>
     <w:p>
@@ -185,7 +185,7 @@
           <w:color w:val="000000"/>
           <w:sz w:val="17"/>
         </w:rPr>
-        <w:t>Desarrollé de extremo a extremo informes editables de propiedades y un editor de imágenes con Grover y Puppeteer, sustituyendo una única plantilla predeterminada por documentos configurables para presentar nuevos datos a clientes.</w:t>
+        <w:t>Participé en el desarrollo de informes editables de propiedades y de un editor de imágenes con Grover y Puppeteer, contribuyendo a sustituir una única plantilla predeterminada por documentos configurables para presentar nuevos datos a clientes.</w:t>
       </w:r>
     </w:p>
     <w:p>

</xml_diff>